<commit_message>
Update project doc with logo and theme color reference
</commit_message>
<xml_diff>
--- a/AppliedAM_Project_Status.docx
+++ b/AppliedAM_Project_Status.docx
@@ -2510,6 +2510,1056 @@
           <w:szCs w:val="22"/>
         </w:rPr>
         <w:t xml:space="preserve">Test locally with hugo server -D --disableFastRender before pushing to master</w:t>
+      </w:r>
+    </w:p>
+    <w:p>
+      <w:pPr>
+        <w:pStyle w:val="Heading1"/>
+        <w:pBdr>
+          <w:bottom w:val="single" w:sz="6" w:space="4" w:color="0077FF"/>
+        </w:pBdr>
+        <w:spacing w:before="360" w:after="200"/>
+        <w:outlineLvl w:val="0"/>
+      </w:pPr>
+      <w:r>
+        <w:rPr>
+          <w:b/>
+          <w:color w:val="1A1A2E"/>
+          <w:sz w:val="32"/>
+          <w:szCs w:val="32"/>
+        </w:rPr>
+        <w:t>10. Brand &amp; Theme Color Reference</w:t>
+      </w:r>
+    </w:p>
+    <w:p>
+      <w:pPr>
+        <w:pStyle w:val="Heading2"/>
+        <w:spacing w:before="240" w:after="140"/>
+        <w:outlineLvl w:val="1"/>
+      </w:pPr>
+      <w:r>
+        <w:rPr>
+          <w:b/>
+          <w:color w:val="1A3A8C"/>
+          <w:sz w:val="26"/>
+          <w:szCs w:val="26"/>
+        </w:rPr>
+        <w:t>10.1 Logo Color Palette (source colors)</w:t>
+      </w:r>
+    </w:p>
+    <w:p>
+      <w:pPr>
+        <w:spacing w:after="120"/>
+      </w:pPr>
+      <w:r>
+        <w:rPr>
+          <w:sz w:val="22"/>
+          <w:szCs w:val="22"/>
+        </w:rPr>
+        <w:t>Sampled and provided from the AppliedAM triangle/pyramid logo (three horizontal slices: top, middle, bottom). Two shades were identified per slice (darker and lighter sides).</w:t>
+      </w:r>
+    </w:p>
+    <w:tbl>
+      <w:tblPr>
+        <w:tblW w:w="9360" w:type="dxa"/>
+        <w:tblBorders>
+          <w:top w:val="single" w:sz="4" w:color="CCCCCC"/>
+          <w:left w:val="single" w:sz="4" w:color="CCCCCC"/>
+          <w:bottom w:val="single" w:sz="4" w:color="CCCCCC"/>
+          <w:right w:val="single" w:sz="4" w:color="CCCCCC"/>
+          <w:insideH w:val="single" w:sz="4" w:color="CCCCCC"/>
+          <w:insideV w:val="single" w:sz="4" w:color="CCCCCC"/>
+        </w:tblBorders>
+        <w:tblLayout w:type="fixed"/>
+        <w:tblCellMar>
+          <w:top w:w="80" w:type="dxa"/>
+          <w:left w:w="120" w:type="dxa"/>
+          <w:bottom w:w="80" w:type="dxa"/>
+          <w:right w:w="120" w:type="dxa"/>
+        </w:tblCellMar>
+      </w:tblPr>
+      <w:tblGrid>
+        <w:gridCol w:w="2340"/>
+        <w:gridCol w:w="1500"/>
+        <w:gridCol w:w="2160"/>
+        <w:gridCol w:w="1680"/>
+        <w:gridCol w:w="1680"/>
+      </w:tblGrid>
+      <w:tr>
+        <w:tc>
+          <w:tcPr>
+            <w:tcW w:w="2340" w:type="dxa"/>
+            <w:shd w:val="clear" w:fill="1A1A2E"/>
+          </w:tcPr>
+          <w:p>
+            <w:r>
+              <w:rPr>
+                <w:b/>
+                <w:color w:val="FFFFFF"/>
+                <w:sz w:val="20"/>
+              </w:rPr>
+              <w:t>Slice / Role</w:t>
+            </w:r>
+          </w:p>
+        </w:tc>
+        <w:tc>
+          <w:tcPr>
+            <w:tcW w:w="1500" w:type="dxa"/>
+            <w:shd w:val="clear" w:fill="1A1A2E"/>
+          </w:tcPr>
+          <w:p>
+            <w:r>
+              <w:rPr>
+                <w:b/>
+                <w:color w:val="FFFFFF"/>
+                <w:sz w:val="20"/>
+              </w:rPr>
+              <w:t>Swatch</w:t>
+            </w:r>
+          </w:p>
+        </w:tc>
+        <w:tc>
+          <w:tcPr>
+            <w:tcW w:w="2160" w:type="dxa"/>
+            <w:shd w:val="clear" w:fill="1A1A2E"/>
+          </w:tcPr>
+          <w:p>
+            <w:r>
+              <w:rPr>
+                <w:b/>
+                <w:color w:val="FFFFFF"/>
+                <w:sz w:val="20"/>
+              </w:rPr>
+              <w:t>Hex</w:t>
+            </w:r>
+          </w:p>
+        </w:tc>
+        <w:tc>
+          <w:tcPr>
+            <w:tcW w:w="1680" w:type="dxa"/>
+            <w:shd w:val="clear" w:fill="1A1A2E"/>
+          </w:tcPr>
+          <w:p>
+            <w:r>
+              <w:rPr>
+                <w:b/>
+                <w:color w:val="FFFFFF"/>
+                <w:sz w:val="20"/>
+              </w:rPr>
+              <w:t>RGB</w:t>
+            </w:r>
+          </w:p>
+        </w:tc>
+        <w:tc>
+          <w:tcPr>
+            <w:tcW w:w="1680" w:type="dxa"/>
+            <w:shd w:val="clear" w:fill="1A1A2E"/>
+          </w:tcPr>
+          <w:p>
+            <w:r>
+              <w:rPr>
+                <w:b/>
+                <w:color w:val="FFFFFF"/>
+                <w:sz w:val="20"/>
+              </w:rPr>
+              <w:t>Shade</w:t>
+            </w:r>
+          </w:p>
+        </w:tc>
+      </w:tr>
+      <w:tr>
+        <w:tc>
+          <w:tcPr>
+            <w:tcW w:w="2340" w:type="dxa"/>
+          </w:tcPr>
+          <w:p>
+            <w:r>
+              <w:rPr>
+                <w:sz w:val="20"/>
+              </w:rPr>
+              <w:t>Dark Blue (top / shadow)</w:t>
+            </w:r>
+          </w:p>
+        </w:tc>
+        <w:tc>
+          <w:tcPr>
+            <w:tcW w:w="1500" w:type="dxa"/>
+            <w:shd w:val="clear" w:fill="0B3D91"/>
+          </w:tcPr>
+          <w:p>
+            <w:r>
+              <w:t/>
+            </w:r>
+          </w:p>
+        </w:tc>
+        <w:tc>
+          <w:tcPr>
+            <w:tcW w:w="2160" w:type="dxa"/>
+          </w:tcPr>
+          <w:p>
+            <w:r>
+              <w:rPr>
+                <w:sz w:val="20"/>
+              </w:rPr>
+              <w:t>#0B3D91</w:t>
+            </w:r>
+          </w:p>
+        </w:tc>
+        <w:tc>
+          <w:tcPr>
+            <w:tcW w:w="1680" w:type="dxa"/>
+          </w:tcPr>
+          <w:p>
+            <w:r>
+              <w:rPr>
+                <w:sz w:val="20"/>
+              </w:rPr>
+              <w:t>11, 61, 145</w:t>
+            </w:r>
+          </w:p>
+        </w:tc>
+        <w:tc>
+          <w:tcPr>
+            <w:tcW w:w="1680" w:type="dxa"/>
+          </w:tcPr>
+          <w:p>
+            <w:r>
+              <w:rPr>
+                <w:sz w:val="20"/>
+              </w:rPr>
+              <w:t>Dark</w:t>
+            </w:r>
+          </w:p>
+        </w:tc>
+      </w:tr>
+      <w:tr>
+        <w:tc>
+          <w:tcPr>
+            <w:tcW w:w="2340" w:type="dxa"/>
+          </w:tcPr>
+          <w:p>
+            <w:r>
+              <w:rPr>
+                <w:sz w:val="20"/>
+              </w:rPr>
+              <w:t>Medium Blue (main face)</w:t>
+            </w:r>
+          </w:p>
+        </w:tc>
+        <w:tc>
+          <w:tcPr>
+            <w:tcW w:w="1500" w:type="dxa"/>
+            <w:shd w:val="clear" w:fill="1E6FD9"/>
+          </w:tcPr>
+          <w:p>
+            <w:r>
+              <w:t/>
+            </w:r>
+          </w:p>
+        </w:tc>
+        <w:tc>
+          <w:tcPr>
+            <w:tcW w:w="2160" w:type="dxa"/>
+          </w:tcPr>
+          <w:p>
+            <w:r>
+              <w:rPr>
+                <w:sz w:val="20"/>
+              </w:rPr>
+              <w:t>#1E6FD9</w:t>
+            </w:r>
+          </w:p>
+        </w:tc>
+        <w:tc>
+          <w:tcPr>
+            <w:tcW w:w="1680" w:type="dxa"/>
+          </w:tcPr>
+          <w:p>
+            <w:r>
+              <w:rPr>
+                <w:sz w:val="20"/>
+              </w:rPr>
+              <w:t>30, 111, 217</w:t>
+            </w:r>
+          </w:p>
+        </w:tc>
+        <w:tc>
+          <w:tcPr>
+            <w:tcW w:w="1680" w:type="dxa"/>
+          </w:tcPr>
+          <w:p>
+            <w:r>
+              <w:rPr>
+                <w:sz w:val="20"/>
+              </w:rPr>
+              <w:t>Medium</w:t>
+            </w:r>
+          </w:p>
+        </w:tc>
+      </w:tr>
+      <w:tr>
+        <w:tc>
+          <w:tcPr>
+            <w:tcW w:w="2340" w:type="dxa"/>
+          </w:tcPr>
+          <w:p>
+            <w:r>
+              <w:rPr>
+                <w:sz w:val="20"/>
+              </w:rPr>
+              <w:t>Light Blue (highlight layer)</w:t>
+            </w:r>
+          </w:p>
+        </w:tc>
+        <w:tc>
+          <w:tcPr>
+            <w:tcW w:w="1500" w:type="dxa"/>
+            <w:shd w:val="clear" w:fill="4FA3F7"/>
+          </w:tcPr>
+          <w:p>
+            <w:r>
+              <w:t/>
+            </w:r>
+          </w:p>
+        </w:tc>
+        <w:tc>
+          <w:tcPr>
+            <w:tcW w:w="2160" w:type="dxa"/>
+          </w:tcPr>
+          <w:p>
+            <w:r>
+              <w:rPr>
+                <w:sz w:val="20"/>
+              </w:rPr>
+              <w:t>#4FA3F7</w:t>
+            </w:r>
+          </w:p>
+        </w:tc>
+        <w:tc>
+          <w:tcPr>
+            <w:tcW w:w="1680" w:type="dxa"/>
+          </w:tcPr>
+          <w:p>
+            <w:r>
+              <w:rPr>
+                <w:sz w:val="20"/>
+              </w:rPr>
+              <w:t>79, 163, 247</w:t>
+            </w:r>
+          </w:p>
+        </w:tc>
+        <w:tc>
+          <w:tcPr>
+            <w:tcW w:w="1680" w:type="dxa"/>
+          </w:tcPr>
+          <w:p>
+            <w:r>
+              <w:rPr>
+                <w:sz w:val="20"/>
+              </w:rPr>
+              <w:t>Light</w:t>
+            </w:r>
+          </w:p>
+        </w:tc>
+      </w:tr>
+      <w:tr>
+        <w:tc>
+          <w:tcPr>
+            <w:tcW w:w="2340" w:type="dxa"/>
+          </w:tcPr>
+          <w:p>
+            <w:r>
+              <w:rPr>
+                <w:sz w:val="20"/>
+              </w:rPr>
+              <w:t>Dark Gray (shadow base)</w:t>
+            </w:r>
+          </w:p>
+        </w:tc>
+        <w:tc>
+          <w:tcPr>
+            <w:tcW w:w="1500" w:type="dxa"/>
+            <w:shd w:val="clear" w:fill="2F3A4A"/>
+          </w:tcPr>
+          <w:p>
+            <w:r>
+              <w:t/>
+            </w:r>
+          </w:p>
+        </w:tc>
+        <w:tc>
+          <w:tcPr>
+            <w:tcW w:w="2160" w:type="dxa"/>
+          </w:tcPr>
+          <w:p>
+            <w:r>
+              <w:rPr>
+                <w:sz w:val="20"/>
+              </w:rPr>
+              <w:t>#2F3A4A</w:t>
+            </w:r>
+          </w:p>
+        </w:tc>
+        <w:tc>
+          <w:tcPr>
+            <w:tcW w:w="1680" w:type="dxa"/>
+          </w:tcPr>
+          <w:p>
+            <w:r>
+              <w:rPr>
+                <w:sz w:val="20"/>
+              </w:rPr>
+              <w:t>47, 58, 74</w:t>
+            </w:r>
+          </w:p>
+        </w:tc>
+        <w:tc>
+          <w:tcPr>
+            <w:tcW w:w="1680" w:type="dxa"/>
+          </w:tcPr>
+          <w:p>
+            <w:r>
+              <w:rPr>
+                <w:sz w:val="20"/>
+              </w:rPr>
+              <w:t>Dark</w:t>
+            </w:r>
+          </w:p>
+        </w:tc>
+      </w:tr>
+      <w:tr>
+        <w:tc>
+          <w:tcPr>
+            <w:tcW w:w="2340" w:type="dxa"/>
+          </w:tcPr>
+          <w:p>
+            <w:r>
+              <w:rPr>
+                <w:sz w:val="20"/>
+              </w:rPr>
+              <w:t>Light Gray (bottom layer)</w:t>
+            </w:r>
+          </w:p>
+        </w:tc>
+        <w:tc>
+          <w:tcPr>
+            <w:tcW w:w="1500" w:type="dxa"/>
+            <w:shd w:val="clear" w:fill="BFC5CE"/>
+          </w:tcPr>
+          <w:p>
+            <w:r>
+              <w:t/>
+            </w:r>
+          </w:p>
+        </w:tc>
+        <w:tc>
+          <w:tcPr>
+            <w:tcW w:w="2160" w:type="dxa"/>
+          </w:tcPr>
+          <w:p>
+            <w:r>
+              <w:rPr>
+                <w:sz w:val="20"/>
+              </w:rPr>
+              <w:t>#BFC5CE</w:t>
+            </w:r>
+          </w:p>
+        </w:tc>
+        <w:tc>
+          <w:tcPr>
+            <w:tcW w:w="1680" w:type="dxa"/>
+          </w:tcPr>
+          <w:p>
+            <w:r>
+              <w:rPr>
+                <w:sz w:val="20"/>
+              </w:rPr>
+              <w:t>191, 197, 206</w:t>
+            </w:r>
+          </w:p>
+        </w:tc>
+        <w:tc>
+          <w:tcPr>
+            <w:tcW w:w="1680" w:type="dxa"/>
+          </w:tcPr>
+          <w:p>
+            <w:r>
+              <w:rPr>
+                <w:sz w:val="20"/>
+              </w:rPr>
+              <w:t>Light</w:t>
+            </w:r>
+          </w:p>
+        </w:tc>
+      </w:tr>
+    </w:tbl>
+    <w:p>
+      <w:pPr>
+        <w:pStyle w:val="Heading2"/>
+        <w:spacing w:before="240" w:after="140"/>
+        <w:outlineLvl w:val="1"/>
+      </w:pPr>
+      <w:r>
+        <w:rPr>
+          <w:b/>
+          <w:color w:val="1A3A8C"/>
+          <w:sz w:val="26"/>
+          <w:szCs w:val="26"/>
+        </w:rPr>
+        <w:t>10.2 Applied Website Theme Colors (Final)</w:t>
+      </w:r>
+    </w:p>
+    <w:p>
+      <w:pPr>
+        <w:spacing w:after="120"/>
+      </w:pPr>
+      <w:r>
+        <w:rPr>
+          <w:sz w:val="22"/>
+          <w:szCs w:val="22"/>
+        </w:rPr>
+        <w:t>Final colors selected from the palette above, mapped to the three content sections. The mapping follows the logo’s vertical order (bottom to top) and the conceptual flow Research (foundation) → Industry (production) → Case Studies (application/use):</w:t>
+      </w:r>
+    </w:p>
+    <w:tbl>
+      <w:tblPr>
+        <w:tblW w:w="9360" w:type="dxa"/>
+        <w:tblBorders>
+          <w:top w:val="single" w:sz="4" w:color="CCCCCC"/>
+          <w:left w:val="single" w:sz="4" w:color="CCCCCC"/>
+          <w:bottom w:val="single" w:sz="4" w:color="CCCCCC"/>
+          <w:right w:val="single" w:sz="4" w:color="CCCCCC"/>
+          <w:insideH w:val="single" w:sz="4" w:color="CCCCCC"/>
+          <w:insideV w:val="single" w:sz="4" w:color="CCCCCC"/>
+        </w:tblBorders>
+        <w:tblLayout w:type="fixed"/>
+        <w:tblCellMar>
+          <w:top w:w="80" w:type="dxa"/>
+          <w:left w:w="120" w:type="dxa"/>
+          <w:bottom w:w="80" w:type="dxa"/>
+          <w:right w:w="120" w:type="dxa"/>
+        </w:tblCellMar>
+      </w:tblPr>
+      <w:tblGrid>
+        <w:gridCol w:w="1800"/>
+        <w:gridCol w:w="1500"/>
+        <w:gridCol w:w="1860"/>
+        <w:gridCol w:w="2100"/>
+        <w:gridCol w:w="2100"/>
+      </w:tblGrid>
+      <w:tr>
+        <w:tc>
+          <w:tcPr>
+            <w:tcW w:w="1800" w:type="dxa"/>
+            <w:shd w:val="clear" w:fill="1A1A2E"/>
+          </w:tcPr>
+          <w:p>
+            <w:r>
+              <w:rPr>
+                <w:b/>
+                <w:color w:val="FFFFFF"/>
+                <w:sz w:val="20"/>
+              </w:rPr>
+              <w:t>Section</w:t>
+            </w:r>
+          </w:p>
+        </w:tc>
+        <w:tc>
+          <w:tcPr>
+            <w:tcW w:w="1500" w:type="dxa"/>
+            <w:shd w:val="clear" w:fill="1A1A2E"/>
+          </w:tcPr>
+          <w:p>
+            <w:r>
+              <w:rPr>
+                <w:b/>
+                <w:color w:val="FFFFFF"/>
+                <w:sz w:val="20"/>
+              </w:rPr>
+              <w:t>Swatch</w:t>
+            </w:r>
+          </w:p>
+        </w:tc>
+        <w:tc>
+          <w:tcPr>
+            <w:tcW w:w="1860" w:type="dxa"/>
+            <w:shd w:val="clear" w:fill="1A1A2E"/>
+          </w:tcPr>
+          <w:p>
+            <w:r>
+              <w:rPr>
+                <w:b/>
+                <w:color w:val="FFFFFF"/>
+                <w:sz w:val="20"/>
+              </w:rPr>
+              <w:t>Hex (text/accent)</w:t>
+            </w:r>
+          </w:p>
+        </w:tc>
+        <w:tc>
+          <w:tcPr>
+            <w:tcW w:w="2100" w:type="dxa"/>
+            <w:shd w:val="clear" w:fill="1A1A2E"/>
+          </w:tcPr>
+          <w:p>
+            <w:r>
+              <w:rPr>
+                <w:b/>
+                <w:color w:val="FFFFFF"/>
+                <w:sz w:val="20"/>
+              </w:rPr>
+              <w:t>Light Hex (bg/tags)</w:t>
+            </w:r>
+          </w:p>
+        </w:tc>
+        <w:tc>
+          <w:tcPr>
+            <w:tcW w:w="2100" w:type="dxa"/>
+            <w:shd w:val="clear" w:fill="1A1A2E"/>
+          </w:tcPr>
+          <w:p>
+            <w:r>
+              <w:rPr>
+                <w:b/>
+                <w:color w:val="FFFFFF"/>
+                <w:sz w:val="20"/>
+              </w:rPr>
+              <w:t>CSS Variable</w:t>
+            </w:r>
+          </w:p>
+        </w:tc>
+      </w:tr>
+      <w:tr>
+        <w:tc>
+          <w:tcPr>
+            <w:tcW w:w="1800" w:type="dxa"/>
+          </w:tcPr>
+          <w:p>
+            <w:r>
+              <w:rPr>
+                <w:sz w:val="20"/>
+              </w:rPr>
+              <w:t>Research</w:t>
+            </w:r>
+          </w:p>
+        </w:tc>
+        <w:tc>
+          <w:tcPr>
+            <w:tcW w:w="1500" w:type="dxa"/>
+            <w:shd w:val="clear" w:fill="8A94A0"/>
+          </w:tcPr>
+          <w:p>
+            <w:r>
+              <w:t/>
+            </w:r>
+          </w:p>
+        </w:tc>
+        <w:tc>
+          <w:tcPr>
+            <w:tcW w:w="1860" w:type="dxa"/>
+          </w:tcPr>
+          <w:p>
+            <w:r>
+              <w:rPr>
+                <w:sz w:val="20"/>
+              </w:rPr>
+              <w:t>#8A94A0 (mid-gray)</w:t>
+            </w:r>
+          </w:p>
+        </w:tc>
+        <w:tc>
+          <w:tcPr>
+            <w:tcW w:w="2100" w:type="dxa"/>
+          </w:tcPr>
+          <w:p>
+            <w:r>
+              <w:rPr>
+                <w:sz w:val="20"/>
+              </w:rPr>
+              <w:t>#f3f4f6</w:t>
+            </w:r>
+          </w:p>
+        </w:tc>
+        <w:tc>
+          <w:tcPr>
+            <w:tcW w:w="2100" w:type="dxa"/>
+          </w:tcPr>
+          <w:p>
+            <w:r>
+              <w:rPr>
+                <w:sz w:val="20"/>
+              </w:rPr>
+              <w:t>--section-research</w:t>
+            </w:r>
+          </w:p>
+        </w:tc>
+      </w:tr>
+      <w:tr>
+        <w:tc>
+          <w:tcPr>
+            <w:tcW w:w="1800" w:type="dxa"/>
+          </w:tcPr>
+          <w:p>
+            <w:r>
+              <w:rPr>
+                <w:sz w:val="20"/>
+              </w:rPr>
+              <w:t>Industry</w:t>
+            </w:r>
+          </w:p>
+        </w:tc>
+        <w:tc>
+          <w:tcPr>
+            <w:tcW w:w="1500" w:type="dxa"/>
+            <w:shd w:val="clear" w:fill="4FA3F7"/>
+          </w:tcPr>
+          <w:p>
+            <w:r>
+              <w:t/>
+            </w:r>
+          </w:p>
+        </w:tc>
+        <w:tc>
+          <w:tcPr>
+            <w:tcW w:w="1860" w:type="dxa"/>
+          </w:tcPr>
+          <w:p>
+            <w:r>
+              <w:rPr>
+                <w:sz w:val="20"/>
+              </w:rPr>
+              <w:t>#4FA3F7 (light blue)</w:t>
+            </w:r>
+          </w:p>
+        </w:tc>
+        <w:tc>
+          <w:tcPr>
+            <w:tcW w:w="2100" w:type="dxa"/>
+          </w:tcPr>
+          <w:p>
+            <w:r>
+              <w:rPr>
+                <w:sz w:val="20"/>
+              </w:rPr>
+              <w:t>#eaf3fe</w:t>
+            </w:r>
+          </w:p>
+        </w:tc>
+        <w:tc>
+          <w:tcPr>
+            <w:tcW w:w="2100" w:type="dxa"/>
+          </w:tcPr>
+          <w:p>
+            <w:r>
+              <w:rPr>
+                <w:sz w:val="20"/>
+              </w:rPr>
+              <w:t>--section-industry</w:t>
+            </w:r>
+          </w:p>
+        </w:tc>
+      </w:tr>
+      <w:tr>
+        <w:tc>
+          <w:tcPr>
+            <w:tcW w:w="1800" w:type="dxa"/>
+          </w:tcPr>
+          <w:p>
+            <w:r>
+              <w:rPr>
+                <w:sz w:val="20"/>
+              </w:rPr>
+              <w:t>Case Studies</w:t>
+            </w:r>
+          </w:p>
+        </w:tc>
+        <w:tc>
+          <w:tcPr>
+            <w:tcW w:w="1500" w:type="dxa"/>
+            <w:shd w:val="clear" w:fill="1E6FD9"/>
+          </w:tcPr>
+          <w:p>
+            <w:r>
+              <w:t/>
+            </w:r>
+          </w:p>
+        </w:tc>
+        <w:tc>
+          <w:tcPr>
+            <w:tcW w:w="1860" w:type="dxa"/>
+          </w:tcPr>
+          <w:p>
+            <w:r>
+              <w:rPr>
+                <w:sz w:val="20"/>
+              </w:rPr>
+              <w:t>#1E6FD9 (medium blue)</w:t>
+            </w:r>
+          </w:p>
+        </w:tc>
+        <w:tc>
+          <w:tcPr>
+            <w:tcW w:w="2100" w:type="dxa"/>
+          </w:tcPr>
+          <w:p>
+            <w:r>
+              <w:rPr>
+                <w:sz w:val="20"/>
+              </w:rPr>
+              <w:t>#e7f0fc</w:t>
+            </w:r>
+          </w:p>
+        </w:tc>
+        <w:tc>
+          <w:tcPr>
+            <w:tcW w:w="2100" w:type="dxa"/>
+          </w:tcPr>
+          <w:p>
+            <w:r>
+              <w:rPr>
+                <w:sz w:val="20"/>
+              </w:rPr>
+              <w:t>--section-applications</w:t>
+            </w:r>
+          </w:p>
+        </w:tc>
+      </w:tr>
+    </w:tbl>
+    <w:p>
+      <w:pPr>
+        <w:spacing w:after="120" w:before="120"/>
+      </w:pPr>
+      <w:r>
+        <w:rPr>
+          <w:i/>
+          <w:sz w:val="22"/>
+          <w:szCs w:val="22"/>
+        </w:rPr>
+        <w:t>Note: the CSS variable for Case Studies is named --section-applications in custom.css for historical reasons (the section was briefly named “Applications” before settling on “Case Studies”). Functionally it controls the Case Studies section color.</w:t>
+      </w:r>
+    </w:p>
+    <w:p>
+      <w:pPr>
+        <w:pStyle w:val="Heading2"/>
+        <w:spacing w:before="240" w:after="140"/>
+        <w:outlineLvl w:val="1"/>
+      </w:pPr>
+      <w:r>
+        <w:rPr>
+          <w:b/>
+          <w:color w:val="1A3A8C"/>
+          <w:sz w:val="26"/>
+          <w:szCs w:val="26"/>
+        </w:rPr>
+        <w:t>10.3 Core Site Colors (Non-Section)</w:t>
+      </w:r>
+    </w:p>
+    <w:tbl>
+      <w:tblPr>
+        <w:tblW w:w="9360" w:type="dxa"/>
+        <w:tblBorders>
+          <w:top w:val="single" w:sz="4" w:color="CCCCCC"/>
+          <w:left w:val="single" w:sz="4" w:color="CCCCCC"/>
+          <w:bottom w:val="single" w:sz="4" w:color="CCCCCC"/>
+          <w:right w:val="single" w:sz="4" w:color="CCCCCC"/>
+          <w:insideH w:val="single" w:sz="4" w:color="CCCCCC"/>
+          <w:insideV w:val="single" w:sz="4" w:color="CCCCCC"/>
+        </w:tblBorders>
+        <w:tblLayout w:type="fixed"/>
+        <w:tblCellMar>
+          <w:top w:w="80" w:type="dxa"/>
+          <w:left w:w="120" w:type="dxa"/>
+          <w:bottom w:w="80" w:type="dxa"/>
+          <w:right w:w="120" w:type="dxa"/>
+        </w:tblCellMar>
+      </w:tblPr>
+      <w:tblGrid>
+        <w:gridCol w:w="2520"/>
+        <w:gridCol w:w="1500"/>
+        <w:gridCol w:w="2520"/>
+        <w:gridCol w:w="2820"/>
+      </w:tblGrid>
+      <w:tr>
+        <w:tc>
+          <w:tcPr>
+            <w:tcW w:w="2520" w:type="dxa"/>
+            <w:shd w:val="clear" w:fill="1A1A2E"/>
+          </w:tcPr>
+          <w:p>
+            <w:r>
+              <w:rPr>
+                <w:b/>
+                <w:color w:val="FFFFFF"/>
+                <w:sz w:val="20"/>
+              </w:rPr>
+              <w:t>Role</w:t>
+            </w:r>
+          </w:p>
+        </w:tc>
+        <w:tc>
+          <w:tcPr>
+            <w:tcW w:w="1500" w:type="dxa"/>
+            <w:shd w:val="clear" w:fill="1A1A2E"/>
+          </w:tcPr>
+          <w:p>
+            <w:r>
+              <w:rPr>
+                <w:b/>
+                <w:color w:val="FFFFFF"/>
+                <w:sz w:val="20"/>
+              </w:rPr>
+              <w:t>Swatch</w:t>
+            </w:r>
+          </w:p>
+        </w:tc>
+        <w:tc>
+          <w:tcPr>
+            <w:tcW w:w="2520" w:type="dxa"/>
+            <w:shd w:val="clear" w:fill="1A1A2E"/>
+          </w:tcPr>
+          <w:p>
+            <w:r>
+              <w:rPr>
+                <w:b/>
+                <w:color w:val="FFFFFF"/>
+                <w:sz w:val="20"/>
+              </w:rPr>
+              <w:t>Hex</w:t>
+            </w:r>
+          </w:p>
+        </w:tc>
+        <w:tc>
+          <w:tcPr>
+            <w:tcW w:w="2820" w:type="dxa"/>
+            <w:shd w:val="clear" w:fill="1A1A2E"/>
+          </w:tcPr>
+          <w:p>
+            <w:r>
+              <w:rPr>
+                <w:b/>
+                <w:color w:val="FFFFFF"/>
+                <w:sz w:val="20"/>
+              </w:rPr>
+              <w:t>Used For</w:t>
+            </w:r>
+          </w:p>
+        </w:tc>
+      </w:tr>
+      <w:tr>
+        <w:tc>
+          <w:tcPr>
+            <w:tcW w:w="2520" w:type="dxa"/>
+          </w:tcPr>
+          <w:p>
+            <w:r>
+              <w:rPr>
+                <w:sz w:val="20"/>
+              </w:rPr>
+              <w:t>Primary accent</w:t>
+            </w:r>
+          </w:p>
+        </w:tc>
+        <w:tc>
+          <w:tcPr>
+            <w:tcW w:w="1500" w:type="dxa"/>
+            <w:shd w:val="clear" w:fill="0077FF"/>
+          </w:tcPr>
+          <w:p>
+            <w:r>
+              <w:t/>
+            </w:r>
+          </w:p>
+        </w:tc>
+        <w:tc>
+          <w:tcPr>
+            <w:tcW w:w="2520" w:type="dxa"/>
+          </w:tcPr>
+          <w:p>
+            <w:r>
+              <w:rPr>
+                <w:sz w:val="20"/>
+              </w:rPr>
+              <w:t>#0077FF</w:t>
+            </w:r>
+          </w:p>
+        </w:tc>
+        <w:tc>
+          <w:tcPr>
+            <w:tcW w:w="2820" w:type="dxa"/>
+          </w:tcPr>
+          <w:p>
+            <w:r>
+              <w:rPr>
+                <w:sz w:val="20"/>
+              </w:rPr>
+              <w:t>Buttons, links, CTAs, hero badge</w:t>
+            </w:r>
+          </w:p>
+        </w:tc>
+      </w:tr>
+      <w:tr>
+        <w:tc>
+          <w:tcPr>
+            <w:tcW w:w="2520" w:type="dxa"/>
+          </w:tcPr>
+          <w:p>
+            <w:r>
+              <w:rPr>
+                <w:sz w:val="20"/>
+              </w:rPr>
+              <w:t>Header / dark sections</w:t>
+            </w:r>
+          </w:p>
+        </w:tc>
+        <w:tc>
+          <w:tcPr>
+            <w:tcW w:w="1500" w:type="dxa"/>
+            <w:shd w:val="clear" w:fill="0D0D1A"/>
+          </w:tcPr>
+          <w:p>
+            <w:r>
+              <w:t/>
+            </w:r>
+          </w:p>
+        </w:tc>
+        <w:tc>
+          <w:tcPr>
+            <w:tcW w:w="2520" w:type="dxa"/>
+          </w:tcPr>
+          <w:p>
+            <w:r>
+              <w:rPr>
+                <w:sz w:val="20"/>
+              </w:rPr>
+              <w:t>#0D0D1A / #1A1A2E</w:t>
+            </w:r>
+          </w:p>
+        </w:tc>
+        <w:tc>
+          <w:tcPr>
+            <w:tcW w:w="2820" w:type="dxa"/>
+          </w:tcPr>
+          <w:p>
+            <w:r>
+              <w:rPr>
+                <w:sz w:val="20"/>
+              </w:rPr>
+              <w:t>Nav bar, hero background, footer</w:t>
+            </w:r>
+          </w:p>
+        </w:tc>
+      </w:tr>
+    </w:tbl>
+    <w:p>
+      <w:pPr>
+        <w:spacing w:after="120" w:before="120"/>
+      </w:pPr>
+      <w:r>
+        <w:rPr>
+          <w:sz w:val="22"/>
+          <w:szCs w:val="22"/>
+        </w:rPr>
+        <w:t>Fonts: Space Grotesk (display/headings), Inter (body) — both via Google Fonts with Segoe UI / Arial fallback.</w:t>
       </w:r>
     </w:p>
     <w:sectPr>

</xml_diff>